<commit_message>
Remove ASEP, remove admit rates, improve typography (line-height, spacing, bold)
</commit_message>
<xml_diff>
--- a/assets/입시전략_SPS_2028_한글.docx
+++ b/assets/입시전략_SPS_2028_한글.docx
@@ -315,7 +315,7 @@
         <w:rPr>
           <w:sz w:val="19"/>
         </w:rPr>
-        <w:t>ASEP 연구에 AI/ML 기법 적용. 데이터 분석 자동화, 시뮬레이션 가속. → 연구 생산성 자체가 달라짐. 논문 출판 속도 상승.</w:t>
+        <w:t>독립 연구에 AI/ML 기법 적용. 데이터 분석 자동화, 시뮬레이션 가속. → 연구 생산성 자체가 달라짐. 논문 출판 속도 상승.</w:t>
       </w:r>
     </w:p>
     <w:p>
@@ -353,24 +353,6 @@
           <w:sz w:val="20"/>
         </w:rPr>
         <w:t>AI 시대에 논문이 일주일에 하나씩 나와도 이상하지 않습니다. 한 편의 대작을 노리는 것이 아니라, 꾸준히 가시적 결과물을 생산합니다.</w:t>
-      </w:r>
-    </w:p>
-    <w:p>
-      <w:pPr>
-        <w:pStyle w:val="ListBullet"/>
-      </w:pPr>
-      <w:r>
-        <w:rPr>
-          <w:b/>
-          <w:sz w:val="19"/>
-        </w:rPr>
-        <w:t xml:space="preserve">11학년 여름: </w:t>
-      </w:r>
-      <w:r>
-        <w:rPr>
-          <w:sz w:val="19"/>
-        </w:rPr>
-        <w:t>ASEP Externship 연구 → JEI 논문 1편</w:t>
       </w:r>
     </w:p>
     <w:p>
@@ -664,7 +646,7 @@
         <w:rPr>
           <w:sz w:val="20"/>
         </w:rPr>
-        <w:t>SPS에는 두 개의 'Next-Level Learning' 특별 프로그램이 있습니다. 하나는 Applied Science and Engineering Program (ASEP), 다른 하나가 바로 Classical Honors Program입니다.</w:t>
+        <w:t>SPS에는 두 개의 'Next-Level Learning' 특별 프로그램이 있습니다. Classical Honors Program이 있습니다.</w:t>
       </w:r>
     </w:p>
     <w:p>
@@ -1844,7 +1826,7 @@
         <w:rPr>
           <w:sz w:val="19"/>
         </w:rPr>
-        <w:t>SUMAC, Ross, PROMYS 중 하나라도 합격하면 반드시 참석하세요. 이 프로그램들은 합격률 5-15%이며, 대학 입시에서 USAMO 자격과 비슷한 무게를 가집니다. Ross는 수학계에서 가장 엄격하다고 평가받고, SUMAC는 Stanford 이름값으로 브랜드 인지도가 가장 높습니다.</w:t>
+        <w:t>SUMAC, Ross, PROMYS 중 하나라도 합격하면 반드시 참석하세요. 이 프로그램들은 대학 입시에서 USAMO 자격과 비슷한 무게를 가집니다. Ross는 수학계에서 가장 엄격하다고 평가받고, SUMAC는 Stanford 이름값으로 브랜드 인지도가 가장 높습니다.</w:t>
       </w:r>
     </w:p>
     <w:p>
@@ -1862,7 +1844,7 @@
         <w:rPr>
           <w:sz w:val="19"/>
         </w:rPr>
-        <w:t>Canada/USA Mathcamp (합격률 ~15-20%), HCSSiM (Hampshire College), Euler Circle (온라인, 연구 트랙). 또는 추가 dual enrollment (Abstract Algebra, Real Analysis).</w:t>
+        <w:t>Canada/USA Mathcamp (), HCSSiM (Hampshire College), Euler Circle (온라인, 연구 트랙). 또는 추가 dual enrollment (Abstract Algebra, Real Analysis).</w:t>
       </w:r>
     </w:p>
     <w:p>
@@ -2381,116 +2363,7 @@
         <w:rPr>
           <w:color w:val="1A1A2E"/>
         </w:rPr>
-        <w:t>5.3 ASEP 지원 (긴급!)</w:t>
-      </w:r>
-    </w:p>
-    <w:p>
-      <w:r>
-        <w:rPr>
-          <w:b/>
-          <w:color w:val="C0392B"/>
-          <w:sz w:val="20"/>
-        </w:rPr>
-        <w:t>Applied Science and Engineering Program (ASEP)은 SPS에서 가장 선별적인 학업 프로그램입니다.</w:t>
-      </w:r>
-    </w:p>
-    <w:p>
-      <w:pPr>
-        <w:pStyle w:val="ListBullet"/>
-      </w:pPr>
-      <w:r>
-        <w:rPr>
-          <w:b/>
-          <w:sz w:val="19"/>
-        </w:rPr>
-        <w:t xml:space="preserve">선발 규모: </w:t>
-      </w:r>
-      <w:r>
-        <w:rPr>
-          <w:sz w:val="19"/>
-        </w:rPr>
-        <w:t>매년 5th Form 학생 12명만 선발</w:t>
-      </w:r>
-    </w:p>
-    <w:p>
-      <w:pPr>
-        <w:pStyle w:val="ListBullet"/>
-      </w:pPr>
-      <w:r>
-        <w:rPr>
-          <w:b/>
-          <w:sz w:val="19"/>
-        </w:rPr>
-        <w:t xml:space="preserve">여름 연구: </w:t>
-      </w:r>
-      <w:r>
-        <w:rPr>
-          <w:sz w:val="19"/>
-        </w:rPr>
-        <w:t>대학교/연구소 실험실에서 여름 연구 인턴십 (Mass General Hospital, Northeastern 등)</w:t>
-      </w:r>
-    </w:p>
-    <w:p>
-      <w:pPr>
-        <w:pStyle w:val="ListBullet"/>
-      </w:pPr>
-      <w:r>
-        <w:rPr>
-          <w:b/>
-          <w:sz w:val="19"/>
-        </w:rPr>
-        <w:t xml:space="preserve">졸업 프로젝트: </w:t>
-      </w:r>
-      <w:r>
-        <w:rPr>
-          <w:sz w:val="19"/>
-        </w:rPr>
-        <w:t>6th Form에서 Capstone Project + 포스터 발표</w:t>
-      </w:r>
-    </w:p>
-    <w:p>
-      <w:pPr>
-        <w:pStyle w:val="ListBullet"/>
-      </w:pPr>
-      <w:r>
-        <w:rPr>
-          <w:b/>
-          <w:sz w:val="19"/>
-        </w:rPr>
-        <w:t xml:space="preserve">지원 시기: </w:t>
-      </w:r>
-      <w:r>
-        <w:rPr>
-          <w:sz w:val="19"/>
-        </w:rPr>
-        <w:t>4th Form(10학년) 때 지원해야 합니다. 지금이 지원 시기입니다.</w:t>
-      </w:r>
-    </w:p>
-    <w:p>
-      <w:r>
-        <w:rPr>
-          <w:b/>
-          <w:color w:val="1A1A2E"/>
-          <w:sz w:val="20"/>
-        </w:rPr>
-        <w:t xml:space="preserve">전략적 의미: </w:t>
-      </w:r>
-      <w:r>
-        <w:rPr>
-          <w:sz w:val="20"/>
-        </w:rPr>
-        <w:t>Classical Honors Diploma + ASEP 동시 완수는 SPS 역사상 매우 드문 조합입니다. 이 두 가지를 모두 가진 졸업생은 MIT, Harvard, Princeton 입학처에서 즉시 주목하는 프로필이 됩니다.</w:t>
-      </w:r>
-    </w:p>
-    <w:p>
-      <w:pPr>
-        <w:pStyle w:val="Heading2"/>
-      </w:pPr>
-      <w:r>
-        <w:rPr>
-          <w:color w:val="1A1A2E"/>
-        </w:rPr>
-        <w:t>5.4 SPS만의 특별한 기회</w:t>
+        <w:t>5.3 SPS만의 특별한 기회</w:t>
       </w:r>
     </w:p>
     <w:p>
@@ -2850,7 +2723,7 @@
               <w:rPr>
                 <w:sz w:val="16"/>
               </w:rPr>
-              <w:t>ASEP Externship이 이 단계에 해당.</w:t>
+              <w:t>독립 연구 또는 교수 멘토십 기반.</w:t>
             </w:r>
           </w:p>
         </w:tc>
@@ -3686,9 +3559,9 @@
               <w:rPr>
                 <w:sz w:val="16"/>
               </w:rPr>
-              <w:t>참가자 풀이 작음 → ASEP 수준 연구가 있으면</w:t>
+              <w:t>참가자 풀이 작음 → 강한 독립 연구가 있으면</w:t>
               <w:br/>
-              <w:t>ISEF 진출 현실적. 단, 연구 품질이 핵심.</w:t>
+              <w:t>ISEF 진출 현실적.</w:t>
             </w:r>
           </w:p>
         </w:tc>
@@ -3748,7 +3621,7 @@
               </w:rPr>
               <w:t>11-12학년: ISEF 진출 목표.</w:t>
               <w:br/>
-              <w:t>ASEP Externship 연구를 여기에 출품.</w:t>
+              <w:t>독립 연구를 여기에 출품.</w:t>
             </w:r>
           </w:p>
         </w:tc>
@@ -3768,7 +3641,7 @@
         <w:rPr>
           <w:sz w:val="20"/>
         </w:rPr>
-        <w:t>NH State Fair → ISEF 경로에서 이 학생의 가능성은 ASEP Externship 연구의 품질에 전적으로 달려 있습니다. NH 참가자 풀이 캘리포니아나 텍사스 대비 훨씬 적으므로, 대학 연구실에서 수행한 ASEP 수준의 프로젝트는 상대적으로 경쟁력 있습니다. 단, ASEP 없이 교내 수준 프로젝트만으로는 ISEF 진출이 어렵습니다. NESS는 수상 제도가 없으므로 입시 서류에서 'presented research at DHMC' 정도로만 기재 가능합니다.</w:t>
+        <w:t>NH State Fair → ISEF 경로에서 이 학생의 가능성은 NH 참가자 풀이 캘리포니아나 텍사스 대비 훨씬 적으므로, NESS는 수상 제도가 없으므로 입시 서류에서 'presented research at DHMC' 정도로만 기재 가능합니다.</w:t>
       </w:r>
     </w:p>
     <w:p>
@@ -4202,7 +4075,7 @@
         <w:rPr>
           <w:sz w:val="20"/>
         </w:rPr>
-        <w:t>ASEP Externship에서 수행한 연구를 6th Form Capstone으로 발전시킨 후, 그대로 STS에 제출할 수 있습니다. Science Fair 예선을 거칠 필요가 없으므로 NH 인프라의 불안정성 문제를 피할 수 있습니다.</w:t>
+        <w:t>독립 연구를 6th Form Capstone으로 발전시킨 후, 그대로 STS에 제출할 수 있습니다. Science Fair 예선을 거칠 필요가 없으므로 NH 인프라의 불안정성 문제를 피할 수 있습니다.</w:t>
       </w:r>
     </w:p>
     <w:p>
@@ -4237,7 +4110,7 @@
         <w:rPr>
           <w:sz w:val="20"/>
         </w:rPr>
-        <w:t>SPS는 전통적인 Science Fair 문화가 약합니다 (ISEF 참가 이력이 확인되지 않음). 하지만 ASEP 프로그램과 Lindsay Center의 연구 시설이 있으므로, 올바른 경로를 밟으면 ISEF/STS 진출이 충분히 가능합니다.</w:t>
+        <w:t>SPS는 전통적인 Science Fair 문화가 약합니다 (ISEF 참가 이력이 확인되지 않음). 올바른 경로를 밟으면 ISEF/STS 진출이 충분히 가능합니다.</w:t>
       </w:r>
     </w:p>
     <w:p>
@@ -4256,22 +4129,6 @@
         <w:t>14개 실험실, 분자생물학 실험실 (세포 배양실 포함), Hawley Solar Observatory (태양 관측소), NOAA Science-on-a-Sphere (북부 뉴잉글랜드 유일), 열대 온실, Foucault 진자, 로봇공학 시설.</w:t>
       </w:r>
     </w:p>
-    <w:p>
-      <w:r>
-        <w:rPr>
-          <w:b/>
-          <w:color w:val="1A1A2E"/>
-          <w:sz w:val="20"/>
-        </w:rPr>
-        <w:t xml:space="preserve">ASEP 담당: </w:t>
-      </w:r>
-      <w:r>
-        <w:rPr>
-          <w:sz w:val="20"/>
-        </w:rPr>
-        <w:t>Sarah Boylan (ASEP Program Director, 분자생물학).</w:t>
-      </w:r>
-    </w:p>
     <w:tbl>
       <w:tblPr>
         <w:tblStyle w:val="TableGrid"/>
@@ -4385,8 +4242,6 @@
               </w:rPr>
               <w:t>고급 과학 과목 수강. 연구 관심 분야 탐색.</w:t>
               <w:br/>
-              <w:t>ASEP 지원서 준비 (4th Form에 지원해야 함!).</w:t>
-              <w:br/>
               <w:t>NHAS STEM Fellowship 고려 (11학년 대상, 지금 등록 가능).</w:t>
               <w:br/>
               <w:t>NESS STEM Symposium 참관 (2026년 4/25, DHMC).</w:t>
@@ -4445,13 +4300,11 @@
               <w:rPr>
                 <w:sz w:val="16"/>
               </w:rPr>
-              <w:t>ASEP 참여 (선발된 경우).</w:t>
+              <w:t>독립 연구 프로젝트 본격 시작.</w:t>
               <w:br/>
-              <w:t>가을/겨울: ASEP 준비 세미나.</w:t>
+              <w:t>교내 멘토(Dr. Cohen, Ben MacBride 등) 지도.</w:t>
               <w:br/>
-              <w:t>봄: ASEP 응용과학 세미나.</w:t>
-              <w:br/>
-              <w:t>여름: 대학/연구소 Externship (연구 프로젝트 시작).</w:t>
+              <w:t>여름: 대학/연구소 연구 기회 탐색.</w:t>
               <w:br/>
               <w:t>NESS STEM Symposium 참가 또는 NH State Fair 준비.</w:t>
             </w:r>
@@ -4470,9 +4323,9 @@
               <w:rPr>
                 <w:sz w:val="16"/>
               </w:rPr>
-              <w:t>JSHS는 2026 현재 운영 중단 상태 — 대안 확인 필요.</w:t>
+              <w:t>독립 연구가 ISEF/STS의 핵심.</w:t>
               <w:br/>
-              <w:t>Externship이 ISEF/STS 연구의 핵심.</w:t>
+              <w:t>교수 cold-email 또는 PRIMES 지원.</w:t>
             </w:r>
           </w:p>
         </w:tc>
@@ -4512,7 +4365,7 @@
               <w:rPr>
                 <w:sz w:val="16"/>
               </w:rPr>
-              <w:t>ASEP Capstone Project (Externship 연구 발전).</w:t>
+              <w:t>Capstone 프로젝트 완성.</w:t>
               <w:br/>
               <w:t>9-10월: NH State Fair 참가 준비 + SRC 승인.</w:t>
               <w:br/>
@@ -4853,7 +4706,7 @@
               <w:rPr>
                 <w:sz w:val="16"/>
               </w:rPr>
-              <w:t>6주 MIT residential. ~3% 합격률. 국제학생 가능 (매년 ~50명 국제).</w:t>
+              <w:t>6주 MIT residential. 국제학생 가능 (매년 ~50명 국제).</w:t>
             </w:r>
           </w:p>
         </w:tc>
@@ -6416,7 +6269,7 @@
         <w:rPr>
           <w:sz w:val="20"/>
         </w:rPr>
-        <w:t>Dartmouth College (차로 90분), UNH (차로 60분) 교수에게 cold-email로 원격 멘토십을 요청할 수 있습니다. MIT PRIMES 프로그램 (원격 수학 연구 멘토십, 12월 마감)도 강력한 대안입니다. ASEP Externship을 통해 대학 연구실 배정을 받으면 자연스럽게 외부 멘토가 생깁니다.</w:t>
+        <w:t>Dartmouth College (차로 90분), UNH (차로 60분) 교수에게 cold-email로 원격 멘토십을 요청할 수 있습니다. MIT PRIMES 프로그램 (원격 수학 연구 멘토십, 12월 마감)도 강력한 대안입니다.</w:t>
       </w:r>
     </w:p>
     <w:p>
@@ -6432,7 +6285,7 @@
         <w:rPr>
           <w:sz w:val="20"/>
         </w:rPr>
-        <w:t>SPS는 Science Fair 전통이 약하므로, 학생이 직접 주도해야 합니다. ASEP 선발이 이 경로의 핵심 관문입니다. ASEP 없이 ISEF/STS를 도전하려면 교외 연구 기회(NHAS STEM Fellowship, 대학 교수 cold-email 등)를 스스로 찾아야 합니다. NH State Fair에 대한 정보는 반드시 Society for Science (isef@societyforscience.org)에 직접 이메일로 확인하세요 — 웹사이트가 없는 것이 정상입니다.</w:t>
+        <w:t>SPS는 Science Fair 전통이 약하므로, 학생이 직접 주도해야 합니다. 교외 연구 기회(NHAS STEM Fellowship, 대학 교수 cold-email 등)를 스스로 찾아야 합니다. NH State Fair에 대한 정보는 반드시 Society for Science (isef@societyforscience.org)에 직접 이메일로 확인하세요 — 웹사이트가 없는 것이 정상입니다.</w:t>
       </w:r>
     </w:p>
     <w:p>
@@ -7403,22 +7256,6 @@
     <w:p>
       <w:r>
         <w:rPr>
-          <w:b/>
-          <w:color w:val="1A1A2E"/>
-          <w:sz w:val="20"/>
-        </w:rPr>
-        <w:t xml:space="preserve">Track B — 연구 논문 (Research Publication): </w:t>
-      </w:r>
-      <w:r>
-        <w:rPr>
-          <w:sz w:val="20"/>
-        </w:rPr>
-        <w:t>peer-reviewed 저널에 실제 출판. ASEP 연구 기반.</w:t>
-      </w:r>
-    </w:p>
-    <w:p>
-      <w:r>
-        <w:rPr>
           <w:sz w:val="20"/>
         </w:rPr>
         <w:t>Concord Review는 역사 에세이 저널이며, 이 학생의 방향(수학/고전학)과 맞지 않아 비추천합니다.</w:t>
@@ -7890,7 +7727,7 @@
         <w:rPr>
           <w:sz w:val="20"/>
         </w:rPr>
-        <w:t>대회 수상이 아니라 실제 학술 저널에 논문을 게재하는 것이 목표입니다. ASEP Externship 연구 또는 독립 수학 연구를 논문으로 발전시킵니다.</w:t>
+        <w:t>대회 수상이 아니라 실제 학술 저널에 논문을 게재하는 것이 목표입니다. 독립 연구를 논문으로 발전시킵니다.</w:t>
       </w:r>
     </w:p>
     <w:tbl>
@@ -8104,7 +7941,7 @@
               <w:rPr>
                 <w:sz w:val="16"/>
               </w:rPr>
-              <w:t>ASEP 연구 → JEI 출판이</w:t>
+              <w:t>독립 연구 → JEI 출판이</w:t>
               <w:br/>
               <w:t>가장 현실적이고 효과적인 경로.</w:t>
             </w:r>
@@ -8420,7 +8257,7 @@
         <w:rPr>
           <w:sz w:val="20"/>
         </w:rPr>
-        <w:t>ASEP Externship 연구 → 6th Form Capstone → JEI 논문 제출 + STS 지원. 같은 연구로 두 가지 결과물(출판 + STS)을 동시에 만듭니다.</w:t>
+        <w:t>독립 연구 → Capstone → JEI 논문 제출 + STS 지원. 같은 연구로 두 가지 결과물(출판 + STS)을 동시에 만듭니다.</w:t>
       </w:r>
     </w:p>
     <w:p>
@@ -9965,11 +9802,10 @@
         <w:tblLook w:firstColumn="1" w:firstRow="1" w:lastColumn="0" w:lastRow="0" w:noHBand="0" w:noVBand="1" w:val="04A0"/>
       </w:tblPr>
       <w:tblGrid>
-        <w:gridCol w:w="1994"/>
-        <w:gridCol w:w="1994"/>
-        <w:gridCol w:w="1994"/>
-        <w:gridCol w:w="1994"/>
-        <w:gridCol w:w="1994"/>
+        <w:gridCol w:w="2493"/>
+        <w:gridCol w:w="2493"/>
+        <w:gridCol w:w="2493"/>
+        <w:gridCol w:w="2493"/>
       </w:tblGrid>
       <w:tr>
         <w:tc>
@@ -9994,7 +9830,7 @@
         </w:tc>
         <w:tc>
           <w:tcPr>
-            <w:tcW w:type="dxa" w:w="850"/>
+            <w:tcW w:type="dxa" w:w="1417"/>
             <w:shd w:fill="1A1A2E" w:val="clear"/>
           </w:tcPr>
           <w:p>
@@ -10008,13 +9844,13 @@
                 <w:color w:val="FFFFFF"/>
                 <w:sz w:val="16"/>
               </w:rPr>
-              <w:t>합격률</w:t>
-            </w:r>
-          </w:p>
-        </w:tc>
-        <w:tc>
-          <w:tcPr>
-            <w:tcW w:type="dxa" w:w="1134"/>
+              <w:t>신호 강도</w:t>
+            </w:r>
+          </w:p>
+        </w:tc>
+        <w:tc>
+          <w:tcPr>
+            <w:tcW w:type="dxa" w:w="1020"/>
             <w:shd w:fill="1A1A2E" w:val="clear"/>
           </w:tcPr>
           <w:p>
@@ -10028,18 +9864,18 @@
                 <w:color w:val="FFFFFF"/>
                 <w:sz w:val="16"/>
               </w:rPr>
-              <w:t>신호 강도</w:t>
-            </w:r>
-          </w:p>
-        </w:tc>
-        <w:tc>
-          <w:tcPr>
-            <w:tcW w:type="dxa" w:w="1020"/>
+              <w:t>현재 상태</w:t>
+            </w:r>
+          </w:p>
+        </w:tc>
+        <w:tc>
+          <w:tcPr>
+            <w:tcW w:type="dxa" w:w="4932"/>
             <w:shd w:fill="1A1A2E" w:val="clear"/>
           </w:tcPr>
           <w:p>
             <w:pPr>
-              <w:jc w:val="center"/>
+              <w:jc w:val="left"/>
             </w:pPr>
             <w:r/>
             <w:r>
@@ -10048,26 +9884,6 @@
                 <w:color w:val="FFFFFF"/>
                 <w:sz w:val="16"/>
               </w:rPr>
-              <w:t>현재 상태</w:t>
-            </w:r>
-          </w:p>
-        </w:tc>
-        <w:tc>
-          <w:tcPr>
-            <w:tcW w:type="dxa" w:w="4082"/>
-            <w:shd w:fill="1A1A2E" w:val="clear"/>
-          </w:tcPr>
-          <w:p>
-            <w:pPr>
-              <w:jc w:val="left"/>
-            </w:pPr>
-            <w:r/>
-            <w:r>
-              <w:rPr>
-                <w:b/>
-                <w:color w:val="FFFFFF"/>
-                <w:sz w:val="16"/>
-              </w:rPr>
               <w:t>설명</w:t>
             </w:r>
           </w:p>
@@ -10094,25 +9910,7 @@
         </w:tc>
         <w:tc>
           <w:tcPr>
-            <w:tcW w:type="dxa" w:w="850"/>
-            <w:shd w:fill="F5F7FA" w:val="clear"/>
-          </w:tcPr>
-          <w:p>
-            <w:pPr>
-              <w:jc w:val="center"/>
-            </w:pPr>
-            <w:r/>
-            <w:r>
-              <w:rPr>
-                <w:sz w:val="16"/>
-              </w:rPr>
-              <w:t>~5-8%</w:t>
-            </w:r>
-          </w:p>
-        </w:tc>
-        <w:tc>
-          <w:tcPr>
-            <w:tcW w:type="dxa" w:w="1134"/>
+            <w:tcW w:type="dxa" w:w="1417"/>
             <w:shd w:fill="F5F7FA" w:val="clear"/>
           </w:tcPr>
           <w:p>
@@ -10148,7 +9946,7 @@
         </w:tc>
         <w:tc>
           <w:tcPr>
-            <w:tcW w:type="dxa" w:w="4082"/>
+            <w:tcW w:type="dxa" w:w="4932"/>
             <w:shd w:fill="F5F7FA" w:val="clear"/>
           </w:tcPr>
           <w:p>
@@ -10185,7 +9983,7 @@
         </w:tc>
         <w:tc>
           <w:tcPr>
-            <w:tcW w:type="dxa" w:w="850"/>
+            <w:tcW w:type="dxa" w:w="1417"/>
           </w:tcPr>
           <w:p>
             <w:pPr>
@@ -10196,13 +9994,13 @@
               <w:rPr>
                 <w:sz w:val="16"/>
               </w:rPr>
-              <w:t>~15%</w:t>
-            </w:r>
-          </w:p>
-        </w:tc>
-        <w:tc>
-          <w:tcPr>
-            <w:tcW w:type="dxa" w:w="1134"/>
+              <w:t>최상위</w:t>
+            </w:r>
+          </w:p>
+        </w:tc>
+        <w:tc>
+          <w:tcPr>
+            <w:tcW w:type="dxa" w:w="1020"/>
           </w:tcPr>
           <w:p>
             <w:pPr>
@@ -10213,30 +10011,13 @@
               <w:rPr>
                 <w:sz w:val="16"/>
               </w:rPr>
-              <w:t>최상위</w:t>
-            </w:r>
-          </w:p>
-        </w:tc>
-        <w:tc>
-          <w:tcPr>
-            <w:tcW w:type="dxa" w:w="1020"/>
-          </w:tcPr>
-          <w:p>
-            <w:pPr>
-              <w:jc w:val="center"/>
-            </w:pPr>
-            <w:r/>
-            <w:r>
-              <w:rPr>
-                <w:sz w:val="16"/>
-              </w:rPr>
               <w:t>지원 완료</w:t>
             </w:r>
           </w:p>
         </w:tc>
         <w:tc>
           <w:tcPr>
-            <w:tcW w:type="dxa" w:w="4082"/>
+            <w:tcW w:type="dxa" w:w="4932"/>
           </w:tcPr>
           <w:p>
             <w:pPr>
@@ -10273,25 +10054,7 @@
         </w:tc>
         <w:tc>
           <w:tcPr>
-            <w:tcW w:type="dxa" w:w="850"/>
-            <w:shd w:fill="F5F7FA" w:val="clear"/>
-          </w:tcPr>
-          <w:p>
-            <w:pPr>
-              <w:jc w:val="center"/>
-            </w:pPr>
-            <w:r/>
-            <w:r>
-              <w:rPr>
-                <w:sz w:val="16"/>
-              </w:rPr>
-              <w:t>~10-15%</w:t>
-            </w:r>
-          </w:p>
-        </w:tc>
-        <w:tc>
-          <w:tcPr>
-            <w:tcW w:type="dxa" w:w="1134"/>
+            <w:tcW w:type="dxa" w:w="1417"/>
             <w:shd w:fill="F5F7FA" w:val="clear"/>
           </w:tcPr>
           <w:p>
@@ -10327,7 +10090,7 @@
         </w:tc>
         <w:tc>
           <w:tcPr>
-            <w:tcW w:type="dxa" w:w="4082"/>
+            <w:tcW w:type="dxa" w:w="4932"/>
             <w:shd w:fill="F5F7FA" w:val="clear"/>
           </w:tcPr>
           <w:p>
@@ -10364,7 +10127,7 @@
         </w:tc>
         <w:tc>
           <w:tcPr>
-            <w:tcW w:type="dxa" w:w="850"/>
+            <w:tcW w:type="dxa" w:w="1417"/>
           </w:tcPr>
           <w:p>
             <w:pPr>
@@ -10375,13 +10138,13 @@
               <w:rPr>
                 <w:sz w:val="16"/>
               </w:rPr>
-              <w:t>공개 등록</w:t>
-            </w:r>
-          </w:p>
-        </w:tc>
-        <w:tc>
-          <w:tcPr>
-            <w:tcW w:type="dxa" w:w="1134"/>
+              <w:t>강함 (dual enrollment)</w:t>
+            </w:r>
+          </w:p>
+        </w:tc>
+        <w:tc>
+          <w:tcPr>
+            <w:tcW w:type="dxa" w:w="1020"/>
           </w:tcPr>
           <w:p>
             <w:pPr>
@@ -10392,30 +10155,13 @@
               <w:rPr>
                 <w:sz w:val="16"/>
               </w:rPr>
-              <w:t>강함 (dual enrollment)</w:t>
-            </w:r>
-          </w:p>
-        </w:tc>
-        <w:tc>
-          <w:tcPr>
-            <w:tcW w:type="dxa" w:w="1020"/>
-          </w:tcPr>
-          <w:p>
-            <w:pPr>
-              <w:jc w:val="center"/>
-            </w:pPr>
-            <w:r/>
-            <w:r>
-              <w:rPr>
-                <w:sz w:val="16"/>
-              </w:rPr>
               <w:t>수강 권장</w:t>
             </w:r>
           </w:p>
         </w:tc>
         <w:tc>
           <w:tcPr>
-            <w:tcW w:type="dxa" w:w="4082"/>
+            <w:tcW w:type="dxa" w:w="4932"/>
           </w:tcPr>
           <w:p>
             <w:pPr>
@@ -10479,7 +10225,7 @@
         <w:rPr>
           <w:sz w:val="19"/>
         </w:rPr>
-        <w:t>Canada/USA Mathcamp 지원 (~15-20% 합격률). 아직 지원 안 했다면 지금 하세요.</w:t>
+        <w:t>Canada/USA Mathcamp 지원. 아직 지원 안 했다면 지금 하세요.</w:t>
       </w:r>
     </w:p>
     <w:p>
@@ -13070,24 +12816,6 @@
           <w:sz w:val="19"/>
         </w:rPr>
         <w:t>4th Form Representative 선거 출마.</w:t>
-      </w:r>
-    </w:p>
-    <w:p>
-      <w:pPr>
-        <w:pStyle w:val="ListBullet"/>
-      </w:pPr>
-      <w:r>
-        <w:rPr>
-          <w:b/>
-          <w:sz w:val="19"/>
-        </w:rPr>
-        <w:t xml:space="preserve">ASEP: </w:t>
-      </w:r>
-      <w:r>
-        <w:rPr>
-          <w:sz w:val="19"/>
-        </w:rPr>
-        <w:t>ASEP 지원서 제출 (12명 선발. 긴급!).</w:t>
       </w:r>
     </w:p>
     <w:p>
@@ -13492,24 +13220,6 @@
           <w:b/>
           <w:sz w:val="19"/>
         </w:rPr>
-        <w:t xml:space="preserve">Science Fair: </w:t>
-      </w:r>
-      <w:r>
-        <w:rPr>
-          <w:sz w:val="19"/>
-        </w:rPr>
-        <w:t>NESS STEM Symposium 또는 NH State Fair 참가 준비. ASEP 연구 기반으로 발표.</w:t>
-      </w:r>
-    </w:p>
-    <w:p>
-      <w:pPr>
-        <w:pStyle w:val="ListBullet"/>
-      </w:pPr>
-      <w:r>
-        <w:rPr>
-          <w:b/>
-          <w:sz w:val="19"/>
-        </w:rPr>
         <w:t xml:space="preserve">스키: </w:t>
       </w:r>
       <w:r>
@@ -13581,7 +13291,7 @@
         <w:rPr>
           <w:sz w:val="19"/>
         </w:rPr>
-        <w:t>ASEP Externship 연구 → 논문 초안 작성. JEI 제출 준비. 동시에 AI 프로젝트 관련 짧은 논문/preprint 가능하면 추가.</w:t>
+        <w:t>독립 연구 → 논문 초안 작성. JEI 제출 준비. 동시에 AI 프로젝트 관련 짧은 논문/preprint 가능하면 추가.</w:t>
       </w:r>
     </w:p>
     <w:p>

</xml_diff>

<commit_message>
Update roadmap + strategy: NLE done, SAT Math 800, ski AI dashboard, Missionary 3 projects, YoungArts, math-approach research
</commit_message>
<xml_diff>
--- a/assets/입시전략_SPS_2028_한글.docx
+++ b/assets/입시전략_SPS_2028_한글.docx
@@ -151,7 +151,7 @@
         <w:rPr>
           <w:sz w:val="19"/>
         </w:rPr>
-        <w:t>대한민국 U17 국가대표 알파인 스키 선수. SPS varsity ski team 소속, captain 목표 (가능성 있음). 겨울 시즌 전지훈련 풀 참가.</w:t>
+        <w:t>대한민국 U17 국가대표 알파인 스키 선수. SPS varsity ski team 소속, captain 목표 (가능성 있음). 겨울 시즌 전지훈련 풀 참가. 스키팀 선수 훈련 관리 AI 대시보드 개발/운영 (교내 레거시).</w:t>
       </w:r>
     </w:p>
     <w:p>
@@ -169,7 +169,7 @@
         <w:rPr>
           <w:sz w:val="19"/>
         </w:rPr>
-        <w:t>미국 Top 20 대학 입학. Classical Studies 전공 지원 의향. AI를 활용한 고전학 기여가 핵심 서사.</w:t>
+        <w:t>미국 Top 20 대학 입학. Classical Studies 전공 지원 의향. AI를 활용한 고전학 기여가 핵심 서사. 연구 접근은 수학적 방법론 기반.</w:t>
       </w:r>
     </w:p>
     <w:p/>
@@ -533,7 +533,7 @@
         <w:rPr>
           <w:sz w:val="20"/>
         </w:rPr>
-        <w:t>1530+ (HYPSM 수준에서 경쟁력 확보). Math 섹션은 790-800 필수.</w:t>
+        <w:t>1530+ (HYPSM 수준에서 경쟁력 확보). **Math 800 나올 때까지 재응시** 목표.</w:t>
       </w:r>
     </w:p>
     <w:p>
@@ -2265,7 +2265,7 @@
         <w:rPr>
           <w:sz w:val="19"/>
         </w:rPr>
-        <w:t>SPS의 지역 봉사 클럽인데 현재 활동이 미미합니다. 이걸 AI 프로젝트로 살립니다. 여름부터 개발 시작 → 11학년에 학교에 가져와서 바로 런칭. 예: 지역 사회 문제를 시각화하는 AI 기반 map dashboard, 또는 AI를 활용한 지역 주민 지원 캠페인. → 섹션 2의 '가시적 임팩트' 원칙에 정확히 부합하는 프로젝트.</w:t>
+        <w:t>SPS의 지역 봉사 클럽인데 현재 활동이 미미합니다. 이걸 AI 프로젝트로 살립니다. 여름부터 개발 시작 → 11학년에 학교에 가져와서 바로 런칭. 구체적 프로젝트 후보 3가지: ① NH Food Finder AI — NH 76,000명 식량 불안정 주민을 위한 푸드뱅크/SNAP 검색 + AI 챗봇 (NH Food Bank 공개 데이터 활용, GitHub Pages 무료 배포). ② NH PFAS Watch — NH 식수 PFAS 오염 데이터를 주민이 이해할 수 있는 지도 + AI 해설로 변환 (NHDES 공개 데이터, 미디어 관심 가능성 높음). ③ Concord Compass — NH 사회 서비스(난방비, Medicaid, 주거 지원 등)를 대화형 AI로 안내하는 도구 (시니어 센터 파일럿 가능). → 섹션 2의 '가시적 임팩트' 원칙에 정확히 부합하는 프로젝트.</w:t>
       </w:r>
     </w:p>
     <w:p>
@@ -7692,7 +7692,7 @@
         <w:rPr>
           <w:sz w:val="20"/>
         </w:rPr>
-        <w:t>Scholastic National Gold Medal + Bennington 1st Place. 둘 다 한국 국적 가능. 둘 다 보딩스쿨 가능. 나머지 대회(NYC Midnight, Adroit Journal, Kenyon Review 등)는 이 두 개에 수상한 후 추가로 고려해도 됩니다. 분산하지 마세요.</w:t>
+        <w:t>Scholastic National Gold Medal + Bennington 1st Place + YoungArts Writing. 둘 다 한국 국적 가능. 둘 다 보딩스쿨 가능. 나머지 대회(NYC Midnight, Adroit Journal, Kenyon Review 등)는 이 두 개에 수상한 후 추가로 고려해도 됩니다. 분산하지 마세요.</w:t>
       </w:r>
     </w:p>
     <w:p>
@@ -12707,7 +12707,7 @@
         <w:rPr>
           <w:sz w:val="19"/>
         </w:rPr>
-        <w:t>NLE Advanced Prose 응시 (2-3월). Summa Cum Laude / Gold 목표.</w:t>
+        <w:t>NLE Advanced Prose 응시 완료 — 결과 대기 중. Gold 목표.</w:t>
       </w:r>
     </w:p>
     <w:p>
@@ -12779,7 +12779,7 @@
         <w:rPr>
           <w:sz w:val="19"/>
         </w:rPr>
-        <w:t>TOEFL 불필요 (영주권자). SAT 준비 집중.</w:t>
+        <w:t>TOEFL 불필요 (영주권자). SAT 준비 — Math 800 목표.</w:t>
       </w:r>
     </w:p>
     <w:p>
@@ -12887,7 +12887,7 @@
         <w:rPr>
           <w:sz w:val="19"/>
         </w:rPr>
-        <w:t>Varsity skiing 유지. FIS 결과 관리.</w:t>
+        <w:t>Varsity skiing 유지. FIS 결과 관리. **스키팀 AI 대시보드 개발 시작** (교내 레거시).</w:t>
       </w:r>
     </w:p>
     <w:p>
@@ -12934,7 +12934,7 @@
         <w:rPr>
           <w:sz w:val="19"/>
         </w:rPr>
-        <w:t>ACT 준비 + 9월 응시 목표. SAT는 8월 또는 11학년 가을.</w:t>
+        <w:t>ACT 준비 → 9월 응시 목표. SAT Math 800 미달 시 8월 재응시.</w:t>
       </w:r>
     </w:p>
     <w:p>

</xml_diff>

<commit_message>
Ski Training Dashboard specifics, Dartmouth mentors (Lynn/Hruby/Vosoughi), roadmap PDF report, all pages synced
</commit_message>
<xml_diff>
--- a/assets/입시전략_SPS_2028_한글.docx
+++ b/assets/입시전략_SPS_2028_한글.docx
@@ -151,7 +151,7 @@
         <w:rPr>
           <w:sz w:val="19"/>
         </w:rPr>
-        <w:t>대한민국 U17 국가대표 알파인 스키 선수. SPS varsity ski team 소속, captain 목표 (가능성 있음). 겨울 시즌 전지훈련 풀 참가. 스키팀 선수 훈련 관리 AI 대시보드 개발/운영 (교내 레거시).</w:t>
+        <w:t>대한민국 U17 국가대표 알파인 스키 선수. SPS varsity ski team 소속, captain 목표 (가능성 있음). 겨울 시즌 전지훈련 풀 참가. 스키팀 Training Load &amp; Season Dashboard 개발/운영 — 선수 Google Form 입력 → 코치용 자동 대시보드 (부하 추적, 컨디션, 시즌 목표 진행률). 교내 레거시.</w:t>
       </w:r>
     </w:p>
     <w:p>
@@ -12887,7 +12887,7 @@
         <w:rPr>
           <w:sz w:val="19"/>
         </w:rPr>
-        <w:t>Varsity skiing 유지. FIS 결과 관리. **스키팀 AI 대시보드 개발 시작** (교내 레거시).</w:t>
+        <w:t>Varsity skiing 유지. FIS 결과 관리. **스키팀 Training Dashboard 개발 시작** — Google Form + Chart.js 자동 대시보드 (교내 레거시).</w:t>
       </w:r>
     </w:p>
     <w:p>

</xml_diff>